<commit_message>
feat: update various files for improved functionality and UI enhancements
</commit_message>
<xml_diff>
--- a/templates/label_box.docx
+++ b/templates/label_box.docx
@@ -106,7 +106,6 @@
                 <w:rFonts w:ascii="Arial Narrow" w:hAnsi="Arial Narrow"/>
               </w:rPr>
             </w:pPr>
-            <w:proofErr w:type="gramStart"/>
             <w:r>
               <w:rPr>
                 <w:rFonts w:ascii="Arial Narrow" w:hAnsi="Arial Narrow"/>
@@ -127,7 +126,6 @@
               </w:rPr>
               <w:t>{</w:t>
             </w:r>
-            <w:proofErr w:type="gramEnd"/>
             <w:r>
               <w:rPr>
                 <w:rFonts w:ascii="Arial Narrow" w:hAnsi="Arial Narrow"/>
@@ -210,6 +208,9 @@
           <w:p>
             <w:pPr>
               <w:jc w:val="center"/>
+              <w:rPr>
+                <w:rFonts w:ascii="Arial Narrow" w:hAnsi="Arial Narrow"/>
+              </w:rPr>
             </w:pPr>
           </w:p>
         </w:tc>
@@ -278,8 +279,10 @@
               <w:spacing w:after="0" w:line="240" w:lineRule="auto"/>
               <w:ind w:left="-293"/>
               <w:jc w:val="center"/>
-            </w:pPr>
-            <w:proofErr w:type="gramStart"/>
+              <w:rPr>
+                <w:rFonts w:ascii="Arial Narrow" w:hAnsi="Arial Narrow"/>
+              </w:rPr>
+            </w:pPr>
             <w:r>
               <w:rPr>
                 <w:rFonts w:ascii="Arial Narrow" w:hAnsi="Arial Narrow"/>
@@ -300,7 +303,6 @@
               </w:rPr>
               <w:t>{</w:t>
             </w:r>
-            <w:proofErr w:type="gramEnd"/>
             <w:r>
               <w:rPr>
                 <w:rFonts w:ascii="Arial Narrow" w:hAnsi="Arial Narrow"/>
@@ -343,7 +345,7 @@
               <w:rPr>
                 <w:rFonts w:ascii="Arial Narrow" w:hAnsi="Arial Narrow"/>
               </w:rPr>
-              <w:t>2</w:t>
+              <w:t>11</w:t>
             </w:r>
             <w:r>
               <w:rPr>
@@ -393,7 +395,13 @@
               <w:right w:w="0" w:type="dxa"/>
             </w:tcMar>
           </w:tcPr>
-          <w:p/>
+          <w:p>
+            <w:pPr>
+              <w:rPr>
+                <w:rFonts w:ascii="Arial Narrow" w:hAnsi="Arial Narrow"/>
+              </w:rPr>
+            </w:pPr>
+          </w:p>
         </w:tc>
         <w:tc>
           <w:tcPr>
@@ -460,8 +468,10 @@
               <w:spacing w:after="0" w:line="240" w:lineRule="auto"/>
               <w:ind w:left="-293"/>
               <w:jc w:val="center"/>
-            </w:pPr>
-            <w:proofErr w:type="gramStart"/>
+              <w:rPr>
+                <w:rFonts w:ascii="Arial Narrow" w:hAnsi="Arial Narrow"/>
+              </w:rPr>
+            </w:pPr>
             <w:r>
               <w:rPr>
                 <w:rFonts w:ascii="Arial Narrow" w:hAnsi="Arial Narrow"/>
@@ -482,7 +492,6 @@
               </w:rPr>
               <w:t>{</w:t>
             </w:r>
-            <w:proofErr w:type="gramEnd"/>
             <w:r>
               <w:rPr>
                 <w:rFonts w:ascii="Arial Narrow" w:hAnsi="Arial Narrow"/>
@@ -525,7 +534,7 @@
               <w:rPr>
                 <w:rFonts w:ascii="Arial Narrow" w:hAnsi="Arial Narrow"/>
               </w:rPr>
-              <w:t>3</w:t>
+              <w:t>21</w:t>
             </w:r>
             <w:r>
               <w:rPr>
@@ -568,6 +577,9 @@
           <w:p>
             <w:pPr>
               <w:spacing w:after="160" w:line="278" w:lineRule="auto"/>
+              <w:rPr>
+                <w:rFonts w:ascii="Arial Narrow" w:hAnsi="Arial Narrow"/>
+              </w:rPr>
             </w:pPr>
           </w:p>
         </w:tc>
@@ -613,6 +625,9 @@
           <w:p>
             <w:pPr>
               <w:spacing w:after="160" w:line="278" w:lineRule="auto"/>
+              <w:rPr>
+                <w:rFonts w:ascii="Arial Narrow" w:hAnsi="Arial Narrow"/>
+              </w:rPr>
             </w:pPr>
             <w:r>
               <w:rPr>
@@ -695,8 +710,10 @@
               <w:spacing w:after="0" w:line="240" w:lineRule="auto"/>
               <w:ind w:left="-293"/>
               <w:jc w:val="center"/>
-            </w:pPr>
-            <w:proofErr w:type="gramStart"/>
+              <w:rPr>
+                <w:rFonts w:ascii="Arial Narrow" w:hAnsi="Arial Narrow"/>
+              </w:rPr>
+            </w:pPr>
             <w:r>
               <w:rPr>
                 <w:rFonts w:ascii="Arial Narrow" w:hAnsi="Arial Narrow"/>
@@ -717,7 +734,6 @@
               </w:rPr>
               <w:t>{</w:t>
             </w:r>
-            <w:proofErr w:type="gramEnd"/>
             <w:r>
               <w:rPr>
                 <w:rFonts w:ascii="Arial Narrow" w:hAnsi="Arial Narrow"/>
@@ -760,7 +776,7 @@
               <w:rPr>
                 <w:rFonts w:ascii="Arial Narrow" w:hAnsi="Arial Narrow"/>
               </w:rPr>
-              <w:t>4</w:t>
+              <w:t>2</w:t>
             </w:r>
             <w:r>
               <w:rPr>
@@ -806,6 +822,9 @@
           <w:p>
             <w:pPr>
               <w:jc w:val="center"/>
+              <w:rPr>
+                <w:rFonts w:ascii="Arial Narrow" w:hAnsi="Arial Narrow"/>
+              </w:rPr>
             </w:pPr>
           </w:p>
         </w:tc>
@@ -874,8 +893,10 @@
               <w:spacing w:after="0" w:line="240" w:lineRule="auto"/>
               <w:ind w:left="-293"/>
               <w:jc w:val="center"/>
-            </w:pPr>
-            <w:proofErr w:type="gramStart"/>
+              <w:rPr>
+                <w:rFonts w:ascii="Arial Narrow" w:hAnsi="Arial Narrow"/>
+              </w:rPr>
+            </w:pPr>
             <w:r>
               <w:rPr>
                 <w:rFonts w:ascii="Arial Narrow" w:hAnsi="Arial Narrow"/>
@@ -896,7 +917,6 @@
               </w:rPr>
               <w:t>{</w:t>
             </w:r>
-            <w:proofErr w:type="gramEnd"/>
             <w:r>
               <w:rPr>
                 <w:rFonts w:ascii="Arial Narrow" w:hAnsi="Arial Narrow"/>
@@ -939,7 +959,7 @@
               <w:rPr>
                 <w:rFonts w:ascii="Arial Narrow" w:hAnsi="Arial Narrow"/>
               </w:rPr>
-              <w:t>5</w:t>
+              <w:t>12</w:t>
             </w:r>
             <w:r>
               <w:rPr>
@@ -989,7 +1009,13 @@
               <w:right w:w="0" w:type="dxa"/>
             </w:tcMar>
           </w:tcPr>
-          <w:p/>
+          <w:p>
+            <w:pPr>
+              <w:rPr>
+                <w:rFonts w:ascii="Arial Narrow" w:hAnsi="Arial Narrow"/>
+              </w:rPr>
+            </w:pPr>
+          </w:p>
         </w:tc>
         <w:tc>
           <w:tcPr>
@@ -1056,8 +1082,10 @@
               <w:spacing w:after="0" w:line="240" w:lineRule="auto"/>
               <w:ind w:left="-293"/>
               <w:jc w:val="center"/>
-            </w:pPr>
-            <w:proofErr w:type="gramStart"/>
+              <w:rPr>
+                <w:rFonts w:ascii="Arial Narrow" w:hAnsi="Arial Narrow"/>
+              </w:rPr>
+            </w:pPr>
             <w:r>
               <w:rPr>
                 <w:rFonts w:ascii="Arial Narrow" w:hAnsi="Arial Narrow"/>
@@ -1078,7 +1106,6 @@
               </w:rPr>
               <w:t>{</w:t>
             </w:r>
-            <w:proofErr w:type="gramEnd"/>
             <w:r>
               <w:rPr>
                 <w:rFonts w:ascii="Arial Narrow" w:hAnsi="Arial Narrow"/>
@@ -1121,13 +1148,13 @@
               <w:rPr>
                 <w:rFonts w:ascii="Arial Narrow" w:hAnsi="Arial Narrow"/>
               </w:rPr>
-              <w:t xml:space="preserve">6 </w:t>
-            </w:r>
-            <w:r>
-              <w:rPr>
-                <w:rFonts w:ascii="Arial Narrow" w:hAnsi="Arial Narrow"/>
-              </w:rPr>
-              <w:t xml:space="preserve">of </w:t>
+              <w:t>22</w:t>
+            </w:r>
+            <w:r>
+              <w:rPr>
+                <w:rFonts w:ascii="Arial Narrow" w:hAnsi="Arial Narrow"/>
+              </w:rPr>
+              <w:t xml:space="preserve"> of </w:t>
             </w:r>
             <w:r>
               <w:rPr>
@@ -1229,8 +1256,10 @@
               <w:spacing w:after="0" w:line="240" w:lineRule="auto"/>
               <w:ind w:left="-293"/>
               <w:jc w:val="center"/>
-            </w:pPr>
-            <w:proofErr w:type="gramStart"/>
+              <w:rPr>
+                <w:rFonts w:ascii="Arial Narrow" w:hAnsi="Arial Narrow"/>
+              </w:rPr>
+            </w:pPr>
             <w:r>
               <w:rPr>
                 <w:rFonts w:ascii="Arial Narrow" w:hAnsi="Arial Narrow"/>
@@ -1251,7 +1280,6 @@
               </w:rPr>
               <w:t>{</w:t>
             </w:r>
-            <w:proofErr w:type="gramEnd"/>
             <w:r>
               <w:rPr>
                 <w:rFonts w:ascii="Arial Narrow" w:hAnsi="Arial Narrow"/>
@@ -1294,7 +1322,7 @@
               <w:rPr>
                 <w:rFonts w:ascii="Arial Narrow" w:hAnsi="Arial Narrow"/>
               </w:rPr>
-              <w:t>7</w:t>
+              <w:t>3</w:t>
             </w:r>
             <w:r>
               <w:rPr>
@@ -1340,6 +1368,9 @@
           <w:p>
             <w:pPr>
               <w:jc w:val="center"/>
+              <w:rPr>
+                <w:rFonts w:ascii="Arial Narrow" w:hAnsi="Arial Narrow"/>
+              </w:rPr>
             </w:pPr>
           </w:p>
         </w:tc>
@@ -1408,8 +1439,10 @@
               <w:spacing w:after="0" w:line="240" w:lineRule="auto"/>
               <w:ind w:left="-293"/>
               <w:jc w:val="center"/>
-            </w:pPr>
-            <w:proofErr w:type="gramStart"/>
+              <w:rPr>
+                <w:rFonts w:ascii="Arial Narrow" w:hAnsi="Arial Narrow"/>
+              </w:rPr>
+            </w:pPr>
             <w:r>
               <w:rPr>
                 <w:rFonts w:ascii="Arial Narrow" w:hAnsi="Arial Narrow"/>
@@ -1430,7 +1463,6 @@
               </w:rPr>
               <w:t>{</w:t>
             </w:r>
-            <w:proofErr w:type="gramEnd"/>
             <w:r>
               <w:rPr>
                 <w:rFonts w:ascii="Arial Narrow" w:hAnsi="Arial Narrow"/>
@@ -1473,7 +1505,7 @@
               <w:rPr>
                 <w:rFonts w:ascii="Arial Narrow" w:hAnsi="Arial Narrow"/>
               </w:rPr>
-              <w:t>8</w:t>
+              <w:t>13</w:t>
             </w:r>
             <w:r>
               <w:rPr>
@@ -1523,7 +1555,13 @@
               <w:right w:w="0" w:type="dxa"/>
             </w:tcMar>
           </w:tcPr>
-          <w:p/>
+          <w:p>
+            <w:pPr>
+              <w:rPr>
+                <w:rFonts w:ascii="Arial Narrow" w:hAnsi="Arial Narrow"/>
+              </w:rPr>
+            </w:pPr>
+          </w:p>
         </w:tc>
         <w:tc>
           <w:tcPr>
@@ -1590,8 +1628,10 @@
               <w:spacing w:after="0" w:line="240" w:lineRule="auto"/>
               <w:ind w:left="-293"/>
               <w:jc w:val="center"/>
-            </w:pPr>
-            <w:proofErr w:type="gramStart"/>
+              <w:rPr>
+                <w:rFonts w:ascii="Arial Narrow" w:hAnsi="Arial Narrow"/>
+              </w:rPr>
+            </w:pPr>
             <w:r>
               <w:rPr>
                 <w:rFonts w:ascii="Arial Narrow" w:hAnsi="Arial Narrow"/>
@@ -1612,7 +1652,6 @@
               </w:rPr>
               <w:t>{</w:t>
             </w:r>
-            <w:proofErr w:type="gramEnd"/>
             <w:r>
               <w:rPr>
                 <w:rFonts w:ascii="Arial Narrow" w:hAnsi="Arial Narrow"/>
@@ -1655,7 +1694,7 @@
               <w:rPr>
                 <w:rFonts w:ascii="Arial Narrow" w:hAnsi="Arial Narrow"/>
               </w:rPr>
-              <w:t>9</w:t>
+              <w:t>23</w:t>
             </w:r>
             <w:r>
               <w:rPr>
@@ -1763,8 +1802,10 @@
               <w:spacing w:after="0" w:line="240" w:lineRule="auto"/>
               <w:ind w:left="-293"/>
               <w:jc w:val="center"/>
-            </w:pPr>
-            <w:proofErr w:type="gramStart"/>
+              <w:rPr>
+                <w:rFonts w:ascii="Arial Narrow" w:hAnsi="Arial Narrow"/>
+              </w:rPr>
+            </w:pPr>
             <w:r>
               <w:rPr>
                 <w:rFonts w:ascii="Arial Narrow" w:hAnsi="Arial Narrow"/>
@@ -1785,7 +1826,6 @@
               </w:rPr>
               <w:t>{</w:t>
             </w:r>
-            <w:proofErr w:type="gramEnd"/>
             <w:r>
               <w:rPr>
                 <w:rFonts w:ascii="Arial Narrow" w:hAnsi="Arial Narrow"/>
@@ -1828,19 +1868,13 @@
               <w:rPr>
                 <w:rFonts w:ascii="Arial Narrow" w:hAnsi="Arial Narrow"/>
               </w:rPr>
-              <w:t>1</w:t>
-            </w:r>
-            <w:r>
-              <w:rPr>
-                <w:rFonts w:ascii="Arial Narrow" w:hAnsi="Arial Narrow"/>
-              </w:rPr>
-              <w:t>0</w:t>
-            </w:r>
-            <w:r>
-              <w:rPr>
-                <w:rFonts w:ascii="Arial Narrow" w:hAnsi="Arial Narrow"/>
-              </w:rPr>
-              <w:t xml:space="preserve"> of </w:t>
+              <w:t>4 o</w:t>
+            </w:r>
+            <w:r>
+              <w:rPr>
+                <w:rFonts w:ascii="Arial Narrow" w:hAnsi="Arial Narrow"/>
+              </w:rPr>
+              <w:t xml:space="preserve">f </w:t>
             </w:r>
             <w:r>
               <w:rPr>
@@ -1880,6 +1914,9 @@
           <w:p>
             <w:pPr>
               <w:jc w:val="center"/>
+              <w:rPr>
+                <w:rFonts w:ascii="Arial Narrow" w:hAnsi="Arial Narrow"/>
+              </w:rPr>
             </w:pPr>
           </w:p>
         </w:tc>
@@ -1954,7 +1991,6 @@
                 <w:bCs/>
               </w:rPr>
             </w:pPr>
-            <w:proofErr w:type="gramStart"/>
             <w:r>
               <w:rPr>
                 <w:rFonts w:ascii="Arial Narrow" w:hAnsi="Arial Narrow"/>
@@ -1975,7 +2011,6 @@
               </w:rPr>
               <w:t>{</w:t>
             </w:r>
-            <w:proofErr w:type="gramEnd"/>
             <w:r>
               <w:rPr>
                 <w:rFonts w:ascii="Arial Narrow" w:hAnsi="Arial Narrow"/>
@@ -2018,13 +2053,13 @@
               <w:rPr>
                 <w:rFonts w:ascii="Arial Narrow" w:hAnsi="Arial Narrow"/>
               </w:rPr>
-              <w:t>1</w:t>
-            </w:r>
-            <w:r>
-              <w:rPr>
-                <w:rFonts w:ascii="Arial Narrow" w:hAnsi="Arial Narrow"/>
-              </w:rPr>
-              <w:t xml:space="preserve">1 of </w:t>
+              <w:t>14</w:t>
+            </w:r>
+            <w:r>
+              <w:rPr>
+                <w:rFonts w:ascii="Arial Narrow" w:hAnsi="Arial Narrow"/>
+              </w:rPr>
+              <w:t xml:space="preserve"> of </w:t>
             </w:r>
             <w:r>
               <w:rPr>
@@ -2068,7 +2103,13 @@
               <w:right w:w="0" w:type="dxa"/>
             </w:tcMar>
           </w:tcPr>
-          <w:p/>
+          <w:p>
+            <w:pPr>
+              <w:rPr>
+                <w:rFonts w:ascii="Arial Narrow" w:hAnsi="Arial Narrow"/>
+              </w:rPr>
+            </w:pPr>
+          </w:p>
         </w:tc>
         <w:tc>
           <w:tcPr>
@@ -2135,8 +2176,10 @@
               <w:spacing w:after="0" w:line="240" w:lineRule="auto"/>
               <w:ind w:left="-293"/>
               <w:jc w:val="center"/>
-            </w:pPr>
-            <w:proofErr w:type="gramStart"/>
+              <w:rPr>
+                <w:rFonts w:ascii="Arial Narrow" w:hAnsi="Arial Narrow"/>
+              </w:rPr>
+            </w:pPr>
             <w:r>
               <w:rPr>
                 <w:rFonts w:ascii="Arial Narrow" w:hAnsi="Arial Narrow"/>
@@ -2157,7 +2200,6 @@
               </w:rPr>
               <w:t>{</w:t>
             </w:r>
-            <w:proofErr w:type="gramEnd"/>
             <w:r>
               <w:rPr>
                 <w:rFonts w:ascii="Arial Narrow" w:hAnsi="Arial Narrow"/>
@@ -2200,13 +2242,7 @@
               <w:rPr>
                 <w:rFonts w:ascii="Arial Narrow" w:hAnsi="Arial Narrow"/>
               </w:rPr>
-              <w:t>1</w:t>
-            </w:r>
-            <w:r>
-              <w:rPr>
-                <w:rFonts w:ascii="Arial Narrow" w:hAnsi="Arial Narrow"/>
-              </w:rPr>
-              <w:t>2</w:t>
+              <w:t>24</w:t>
             </w:r>
             <w:r>
               <w:rPr>
@@ -2314,8 +2350,10 @@
               <w:spacing w:after="0" w:line="240" w:lineRule="auto"/>
               <w:ind w:left="-293"/>
               <w:jc w:val="center"/>
-            </w:pPr>
-            <w:proofErr w:type="gramStart"/>
+              <w:rPr>
+                <w:rFonts w:ascii="Arial Narrow" w:hAnsi="Arial Narrow"/>
+              </w:rPr>
+            </w:pPr>
             <w:r>
               <w:rPr>
                 <w:rFonts w:ascii="Arial Narrow" w:hAnsi="Arial Narrow"/>
@@ -2336,7 +2374,6 @@
               </w:rPr>
               <w:t>{</w:t>
             </w:r>
-            <w:proofErr w:type="gramEnd"/>
             <w:r>
               <w:rPr>
                 <w:rFonts w:ascii="Arial Narrow" w:hAnsi="Arial Narrow"/>
@@ -2379,13 +2416,7 @@
               <w:rPr>
                 <w:rFonts w:ascii="Arial Narrow" w:hAnsi="Arial Narrow"/>
               </w:rPr>
-              <w:t>1</w:t>
-            </w:r>
-            <w:r>
-              <w:rPr>
-                <w:rFonts w:ascii="Arial Narrow" w:hAnsi="Arial Narrow"/>
-              </w:rPr>
-              <w:t>3</w:t>
+              <w:t>5</w:t>
             </w:r>
             <w:r>
               <w:rPr>
@@ -2428,7 +2459,13 @@
               <w:right w:w="0" w:type="dxa"/>
             </w:tcMar>
           </w:tcPr>
-          <w:p/>
+          <w:p>
+            <w:pPr>
+              <w:rPr>
+                <w:rFonts w:ascii="Arial Narrow" w:hAnsi="Arial Narrow"/>
+              </w:rPr>
+            </w:pPr>
+          </w:p>
         </w:tc>
         <w:tc>
           <w:tcPr>
@@ -2495,8 +2532,10 @@
               <w:spacing w:after="0" w:line="240" w:lineRule="auto"/>
               <w:ind w:left="-293"/>
               <w:jc w:val="center"/>
-            </w:pPr>
-            <w:proofErr w:type="gramStart"/>
+              <w:rPr>
+                <w:rFonts w:ascii="Arial Narrow" w:hAnsi="Arial Narrow"/>
+              </w:rPr>
+            </w:pPr>
             <w:r>
               <w:rPr>
                 <w:rFonts w:ascii="Arial Narrow" w:hAnsi="Arial Narrow"/>
@@ -2517,7 +2556,6 @@
               </w:rPr>
               <w:t>{</w:t>
             </w:r>
-            <w:proofErr w:type="gramEnd"/>
             <w:r>
               <w:rPr>
                 <w:rFonts w:ascii="Arial Narrow" w:hAnsi="Arial Narrow"/>
@@ -2560,13 +2598,7 @@
               <w:rPr>
                 <w:rFonts w:ascii="Arial Narrow" w:hAnsi="Arial Narrow"/>
               </w:rPr>
-              <w:t>1</w:t>
-            </w:r>
-            <w:r>
-              <w:rPr>
-                <w:rFonts w:ascii="Arial Narrow" w:hAnsi="Arial Narrow"/>
-              </w:rPr>
-              <w:t>4</w:t>
+              <w:t>15</w:t>
             </w:r>
             <w:r>
               <w:rPr>
@@ -2616,7 +2648,13 @@
               <w:right w:w="0" w:type="dxa"/>
             </w:tcMar>
           </w:tcPr>
-          <w:p/>
+          <w:p>
+            <w:pPr>
+              <w:rPr>
+                <w:rFonts w:ascii="Arial Narrow" w:hAnsi="Arial Narrow"/>
+              </w:rPr>
+            </w:pPr>
+          </w:p>
         </w:tc>
         <w:tc>
           <w:tcPr>
@@ -2683,8 +2721,10 @@
               <w:spacing w:after="0" w:line="240" w:lineRule="auto"/>
               <w:ind w:left="-293"/>
               <w:jc w:val="center"/>
-            </w:pPr>
-            <w:proofErr w:type="gramStart"/>
+              <w:rPr>
+                <w:rFonts w:ascii="Arial Narrow" w:hAnsi="Arial Narrow"/>
+              </w:rPr>
+            </w:pPr>
             <w:r>
               <w:rPr>
                 <w:rFonts w:ascii="Arial Narrow" w:hAnsi="Arial Narrow"/>
@@ -2705,7 +2745,6 @@
               </w:rPr>
               <w:t>{</w:t>
             </w:r>
-            <w:proofErr w:type="gramEnd"/>
             <w:r>
               <w:rPr>
                 <w:rFonts w:ascii="Arial Narrow" w:hAnsi="Arial Narrow"/>
@@ -2748,13 +2787,7 @@
               <w:rPr>
                 <w:rFonts w:ascii="Arial Narrow" w:hAnsi="Arial Narrow"/>
               </w:rPr>
-              <w:t>1</w:t>
-            </w:r>
-            <w:r>
-              <w:rPr>
-                <w:rFonts w:ascii="Arial Narrow" w:hAnsi="Arial Narrow"/>
-              </w:rPr>
-              <w:t>5</w:t>
+              <w:t>25</w:t>
             </w:r>
             <w:r>
               <w:rPr>
@@ -2862,8 +2895,10 @@
               <w:spacing w:after="0" w:line="240" w:lineRule="auto"/>
               <w:ind w:left="-293"/>
               <w:jc w:val="center"/>
-            </w:pPr>
-            <w:proofErr w:type="gramStart"/>
+              <w:rPr>
+                <w:rFonts w:ascii="Arial Narrow" w:hAnsi="Arial Narrow"/>
+              </w:rPr>
+            </w:pPr>
             <w:r>
               <w:rPr>
                 <w:rFonts w:ascii="Arial Narrow" w:hAnsi="Arial Narrow"/>
@@ -2884,7 +2919,6 @@
               </w:rPr>
               <w:t>{</w:t>
             </w:r>
-            <w:proofErr w:type="gramEnd"/>
             <w:r>
               <w:rPr>
                 <w:rFonts w:ascii="Arial Narrow" w:hAnsi="Arial Narrow"/>
@@ -2927,19 +2961,7 @@
               <w:rPr>
                 <w:rFonts w:ascii="Arial Narrow" w:hAnsi="Arial Narrow"/>
               </w:rPr>
-              <w:t>1</w:t>
-            </w:r>
-            <w:r>
-              <w:rPr>
-                <w:rFonts w:ascii="Arial Narrow" w:hAnsi="Arial Narrow"/>
-              </w:rPr>
-              <w:t>6</w:t>
-            </w:r>
-            <w:r>
-              <w:rPr>
-                <w:rFonts w:ascii="Arial Narrow" w:hAnsi="Arial Narrow"/>
-              </w:rPr>
-              <w:t xml:space="preserve"> of </w:t>
+              <w:t xml:space="preserve">6 of </w:t>
             </w:r>
             <w:r>
               <w:rPr>
@@ -2976,7 +2998,13 @@
               <w:right w:w="0" w:type="dxa"/>
             </w:tcMar>
           </w:tcPr>
-          <w:p/>
+          <w:p>
+            <w:pPr>
+              <w:rPr>
+                <w:rFonts w:ascii="Arial Narrow" w:hAnsi="Arial Narrow"/>
+              </w:rPr>
+            </w:pPr>
+          </w:p>
         </w:tc>
         <w:tc>
           <w:tcPr>
@@ -3043,8 +3071,10 @@
               <w:spacing w:after="0" w:line="240" w:lineRule="auto"/>
               <w:ind w:left="-293"/>
               <w:jc w:val="center"/>
-            </w:pPr>
-            <w:proofErr w:type="gramStart"/>
+              <w:rPr>
+                <w:rFonts w:ascii="Arial Narrow" w:hAnsi="Arial Narrow"/>
+              </w:rPr>
+            </w:pPr>
             <w:r>
               <w:rPr>
                 <w:rFonts w:ascii="Arial Narrow" w:hAnsi="Arial Narrow"/>
@@ -3065,7 +3095,6 @@
               </w:rPr>
               <w:t>{</w:t>
             </w:r>
-            <w:proofErr w:type="gramEnd"/>
             <w:r>
               <w:rPr>
                 <w:rFonts w:ascii="Arial Narrow" w:hAnsi="Arial Narrow"/>
@@ -3108,13 +3137,7 @@
               <w:rPr>
                 <w:rFonts w:ascii="Arial Narrow" w:hAnsi="Arial Narrow"/>
               </w:rPr>
-              <w:t>1</w:t>
-            </w:r>
-            <w:r>
-              <w:rPr>
-                <w:rFonts w:ascii="Arial Narrow" w:hAnsi="Arial Narrow"/>
-              </w:rPr>
-              <w:t>7</w:t>
+              <w:t>16</w:t>
             </w:r>
             <w:r>
               <w:rPr>
@@ -3164,7 +3187,13 @@
               <w:right w:w="0" w:type="dxa"/>
             </w:tcMar>
           </w:tcPr>
-          <w:p/>
+          <w:p>
+            <w:pPr>
+              <w:rPr>
+                <w:rFonts w:ascii="Arial Narrow" w:hAnsi="Arial Narrow"/>
+              </w:rPr>
+            </w:pPr>
+          </w:p>
         </w:tc>
         <w:tc>
           <w:tcPr>
@@ -3231,8 +3260,10 @@
               <w:spacing w:after="0" w:line="240" w:lineRule="auto"/>
               <w:ind w:left="-293"/>
               <w:jc w:val="center"/>
-            </w:pPr>
-            <w:proofErr w:type="gramStart"/>
+              <w:rPr>
+                <w:rFonts w:ascii="Arial Narrow" w:hAnsi="Arial Narrow"/>
+              </w:rPr>
+            </w:pPr>
             <w:r>
               <w:rPr>
                 <w:rFonts w:ascii="Arial Narrow" w:hAnsi="Arial Narrow"/>
@@ -3253,7 +3284,6 @@
               </w:rPr>
               <w:t>{</w:t>
             </w:r>
-            <w:proofErr w:type="gramEnd"/>
             <w:r>
               <w:rPr>
                 <w:rFonts w:ascii="Arial Narrow" w:hAnsi="Arial Narrow"/>
@@ -3296,13 +3326,7 @@
               <w:rPr>
                 <w:rFonts w:ascii="Arial Narrow" w:hAnsi="Arial Narrow"/>
               </w:rPr>
-              <w:t>1</w:t>
-            </w:r>
-            <w:r>
-              <w:rPr>
-                <w:rFonts w:ascii="Arial Narrow" w:hAnsi="Arial Narrow"/>
-              </w:rPr>
-              <w:t>8</w:t>
+              <w:t>26</w:t>
             </w:r>
             <w:r>
               <w:rPr>
@@ -3410,8 +3434,10 @@
               <w:spacing w:after="0" w:line="240" w:lineRule="auto"/>
               <w:ind w:left="-293"/>
               <w:jc w:val="center"/>
-            </w:pPr>
-            <w:proofErr w:type="gramStart"/>
+              <w:rPr>
+                <w:rFonts w:ascii="Arial Narrow" w:hAnsi="Arial Narrow"/>
+              </w:rPr>
+            </w:pPr>
             <w:r>
               <w:rPr>
                 <w:rFonts w:ascii="Arial Narrow" w:hAnsi="Arial Narrow"/>
@@ -3432,7 +3458,6 @@
               </w:rPr>
               <w:t>{</w:t>
             </w:r>
-            <w:proofErr w:type="gramEnd"/>
             <w:r>
               <w:rPr>
                 <w:rFonts w:ascii="Arial Narrow" w:hAnsi="Arial Narrow"/>
@@ -3475,13 +3500,7 @@
               <w:rPr>
                 <w:rFonts w:ascii="Arial Narrow" w:hAnsi="Arial Narrow"/>
               </w:rPr>
-              <w:t>1</w:t>
-            </w:r>
-            <w:r>
-              <w:rPr>
-                <w:rFonts w:ascii="Arial Narrow" w:hAnsi="Arial Narrow"/>
-              </w:rPr>
-              <w:t>9</w:t>
+              <w:t>7</w:t>
             </w:r>
             <w:r>
               <w:rPr>
@@ -3524,7 +3543,13 @@
               <w:right w:w="0" w:type="dxa"/>
             </w:tcMar>
           </w:tcPr>
-          <w:p/>
+          <w:p>
+            <w:pPr>
+              <w:rPr>
+                <w:rFonts w:ascii="Arial Narrow" w:hAnsi="Arial Narrow"/>
+              </w:rPr>
+            </w:pPr>
+          </w:p>
         </w:tc>
         <w:tc>
           <w:tcPr>
@@ -3591,8 +3616,10 @@
               <w:spacing w:after="0" w:line="240" w:lineRule="auto"/>
               <w:ind w:left="-293"/>
               <w:jc w:val="center"/>
-            </w:pPr>
-            <w:proofErr w:type="gramStart"/>
+              <w:rPr>
+                <w:rFonts w:ascii="Arial Narrow" w:hAnsi="Arial Narrow"/>
+              </w:rPr>
+            </w:pPr>
             <w:r>
               <w:rPr>
                 <w:rFonts w:ascii="Arial Narrow" w:hAnsi="Arial Narrow"/>
@@ -3613,7 +3640,6 @@
               </w:rPr>
               <w:t>{</w:t>
             </w:r>
-            <w:proofErr w:type="gramEnd"/>
             <w:r>
               <w:rPr>
                 <w:rFonts w:ascii="Arial Narrow" w:hAnsi="Arial Narrow"/>
@@ -3656,7 +3682,7 @@
               <w:rPr>
                 <w:rFonts w:ascii="Arial Narrow" w:hAnsi="Arial Narrow"/>
               </w:rPr>
-              <w:t>20</w:t>
+              <w:t>17</w:t>
             </w:r>
             <w:r>
               <w:rPr>
@@ -3706,7 +3732,13 @@
               <w:right w:w="0" w:type="dxa"/>
             </w:tcMar>
           </w:tcPr>
-          <w:p/>
+          <w:p>
+            <w:pPr>
+              <w:rPr>
+                <w:rFonts w:ascii="Arial Narrow" w:hAnsi="Arial Narrow"/>
+              </w:rPr>
+            </w:pPr>
+          </w:p>
         </w:tc>
         <w:tc>
           <w:tcPr>
@@ -3773,8 +3805,10 @@
               <w:spacing w:after="0" w:line="240" w:lineRule="auto"/>
               <w:ind w:left="-293"/>
               <w:jc w:val="center"/>
-            </w:pPr>
-            <w:proofErr w:type="gramStart"/>
+              <w:rPr>
+                <w:rFonts w:ascii="Arial Narrow" w:hAnsi="Arial Narrow"/>
+              </w:rPr>
+            </w:pPr>
             <w:r>
               <w:rPr>
                 <w:rFonts w:ascii="Arial Narrow" w:hAnsi="Arial Narrow"/>
@@ -3795,7 +3829,6 @@
               </w:rPr>
               <w:t>{</w:t>
             </w:r>
-            <w:proofErr w:type="gramEnd"/>
             <w:r>
               <w:rPr>
                 <w:rFonts w:ascii="Arial Narrow" w:hAnsi="Arial Narrow"/>
@@ -3838,13 +3871,13 @@
               <w:rPr>
                 <w:rFonts w:ascii="Arial Narrow" w:hAnsi="Arial Narrow"/>
               </w:rPr>
-              <w:t>2</w:t>
-            </w:r>
-            <w:r>
-              <w:rPr>
-                <w:rFonts w:ascii="Arial Narrow" w:hAnsi="Arial Narrow"/>
-              </w:rPr>
-              <w:t xml:space="preserve">1 of </w:t>
+              <w:t>27</w:t>
+            </w:r>
+            <w:r>
+              <w:rPr>
+                <w:rFonts w:ascii="Arial Narrow" w:hAnsi="Arial Narrow"/>
+              </w:rPr>
+              <w:t xml:space="preserve"> of </w:t>
             </w:r>
             <w:r>
               <w:rPr>
@@ -3946,8 +3979,10 @@
               <w:spacing w:after="0" w:line="240" w:lineRule="auto"/>
               <w:ind w:left="-293"/>
               <w:jc w:val="center"/>
-            </w:pPr>
-            <w:proofErr w:type="gramStart"/>
+              <w:rPr>
+                <w:rFonts w:ascii="Arial Narrow" w:hAnsi="Arial Narrow"/>
+              </w:rPr>
+            </w:pPr>
             <w:r>
               <w:rPr>
                 <w:rFonts w:ascii="Arial Narrow" w:hAnsi="Arial Narrow"/>
@@ -3968,7 +4003,6 @@
               </w:rPr>
               <w:t>{</w:t>
             </w:r>
-            <w:proofErr w:type="gramEnd"/>
             <w:r>
               <w:rPr>
                 <w:rFonts w:ascii="Arial Narrow" w:hAnsi="Arial Narrow"/>
@@ -4011,7 +4045,7 @@
               <w:rPr>
                 <w:rFonts w:ascii="Arial Narrow" w:hAnsi="Arial Narrow"/>
               </w:rPr>
-              <w:t>22</w:t>
+              <w:t>8</w:t>
             </w:r>
             <w:r>
               <w:rPr>
@@ -4054,7 +4088,13 @@
               <w:right w:w="0" w:type="dxa"/>
             </w:tcMar>
           </w:tcPr>
-          <w:p/>
+          <w:p>
+            <w:pPr>
+              <w:rPr>
+                <w:rFonts w:ascii="Arial Narrow" w:hAnsi="Arial Narrow"/>
+              </w:rPr>
+            </w:pPr>
+          </w:p>
         </w:tc>
         <w:tc>
           <w:tcPr>
@@ -4121,8 +4161,10 @@
               <w:spacing w:after="0" w:line="240" w:lineRule="auto"/>
               <w:ind w:left="-293"/>
               <w:jc w:val="center"/>
-            </w:pPr>
-            <w:proofErr w:type="gramStart"/>
+              <w:rPr>
+                <w:rFonts w:ascii="Arial Narrow" w:hAnsi="Arial Narrow"/>
+              </w:rPr>
+            </w:pPr>
             <w:r>
               <w:rPr>
                 <w:rFonts w:ascii="Arial Narrow" w:hAnsi="Arial Narrow"/>
@@ -4143,7 +4185,6 @@
               </w:rPr>
               <w:t>{</w:t>
             </w:r>
-            <w:proofErr w:type="gramEnd"/>
             <w:r>
               <w:rPr>
                 <w:rFonts w:ascii="Arial Narrow" w:hAnsi="Arial Narrow"/>
@@ -4186,7 +4227,7 @@
               <w:rPr>
                 <w:rFonts w:ascii="Arial Narrow" w:hAnsi="Arial Narrow"/>
               </w:rPr>
-              <w:t>23</w:t>
+              <w:t>18</w:t>
             </w:r>
             <w:r>
               <w:rPr>
@@ -4236,7 +4277,13 @@
               <w:right w:w="0" w:type="dxa"/>
             </w:tcMar>
           </w:tcPr>
-          <w:p/>
+          <w:p>
+            <w:pPr>
+              <w:rPr>
+                <w:rFonts w:ascii="Arial Narrow" w:hAnsi="Arial Narrow"/>
+              </w:rPr>
+            </w:pPr>
+          </w:p>
         </w:tc>
         <w:tc>
           <w:tcPr>
@@ -4303,8 +4350,10 @@
               <w:spacing w:after="0" w:line="240" w:lineRule="auto"/>
               <w:ind w:left="-293"/>
               <w:jc w:val="center"/>
-            </w:pPr>
-            <w:proofErr w:type="gramStart"/>
+              <w:rPr>
+                <w:rFonts w:ascii="Arial Narrow" w:hAnsi="Arial Narrow"/>
+              </w:rPr>
+            </w:pPr>
             <w:r>
               <w:rPr>
                 <w:rFonts w:ascii="Arial Narrow" w:hAnsi="Arial Narrow"/>
@@ -4325,7 +4374,6 @@
               </w:rPr>
               <w:t>{</w:t>
             </w:r>
-            <w:proofErr w:type="gramEnd"/>
             <w:r>
               <w:rPr>
                 <w:rFonts w:ascii="Arial Narrow" w:hAnsi="Arial Narrow"/>
@@ -4368,7 +4416,7 @@
               <w:rPr>
                 <w:rFonts w:ascii="Arial Narrow" w:hAnsi="Arial Narrow"/>
               </w:rPr>
-              <w:t>24</w:t>
+              <w:t>28</w:t>
             </w:r>
             <w:r>
               <w:rPr>
@@ -4476,8 +4524,10 @@
               <w:spacing w:after="0" w:line="240" w:lineRule="auto"/>
               <w:ind w:left="-293"/>
               <w:jc w:val="center"/>
-            </w:pPr>
-            <w:proofErr w:type="gramStart"/>
+              <w:rPr>
+                <w:rFonts w:ascii="Arial Narrow" w:hAnsi="Arial Narrow"/>
+              </w:rPr>
+            </w:pPr>
             <w:r>
               <w:rPr>
                 <w:rFonts w:ascii="Arial Narrow" w:hAnsi="Arial Narrow"/>
@@ -4498,7 +4548,6 @@
               </w:rPr>
               <w:t>{</w:t>
             </w:r>
-            <w:proofErr w:type="gramEnd"/>
             <w:r>
               <w:rPr>
                 <w:rFonts w:ascii="Arial Narrow" w:hAnsi="Arial Narrow"/>
@@ -4541,7 +4590,7 @@
               <w:rPr>
                 <w:rFonts w:ascii="Arial Narrow" w:hAnsi="Arial Narrow"/>
               </w:rPr>
-              <w:t>25</w:t>
+              <w:t>9</w:t>
             </w:r>
             <w:r>
               <w:rPr>
@@ -4584,7 +4633,13 @@
               <w:right w:w="0" w:type="dxa"/>
             </w:tcMar>
           </w:tcPr>
-          <w:p/>
+          <w:p>
+            <w:pPr>
+              <w:rPr>
+                <w:rFonts w:ascii="Arial Narrow" w:hAnsi="Arial Narrow"/>
+              </w:rPr>
+            </w:pPr>
+          </w:p>
         </w:tc>
         <w:tc>
           <w:tcPr>
@@ -4651,8 +4706,10 @@
               <w:spacing w:after="0" w:line="240" w:lineRule="auto"/>
               <w:ind w:left="-293"/>
               <w:jc w:val="center"/>
-            </w:pPr>
-            <w:proofErr w:type="gramStart"/>
+              <w:rPr>
+                <w:rFonts w:ascii="Arial Narrow" w:hAnsi="Arial Narrow"/>
+              </w:rPr>
+            </w:pPr>
             <w:r>
               <w:rPr>
                 <w:rFonts w:ascii="Arial Narrow" w:hAnsi="Arial Narrow"/>
@@ -4673,7 +4730,6 @@
               </w:rPr>
               <w:t>{</w:t>
             </w:r>
-            <w:proofErr w:type="gramEnd"/>
             <w:r>
               <w:rPr>
                 <w:rFonts w:ascii="Arial Narrow" w:hAnsi="Arial Narrow"/>
@@ -4716,7 +4772,7 @@
               <w:rPr>
                 <w:rFonts w:ascii="Arial Narrow" w:hAnsi="Arial Narrow"/>
               </w:rPr>
-              <w:t>26</w:t>
+              <w:t>19</w:t>
             </w:r>
             <w:r>
               <w:rPr>
@@ -4766,7 +4822,13 @@
               <w:right w:w="0" w:type="dxa"/>
             </w:tcMar>
           </w:tcPr>
-          <w:p/>
+          <w:p>
+            <w:pPr>
+              <w:rPr>
+                <w:rFonts w:ascii="Arial Narrow" w:hAnsi="Arial Narrow"/>
+              </w:rPr>
+            </w:pPr>
+          </w:p>
         </w:tc>
         <w:tc>
           <w:tcPr>
@@ -4833,8 +4895,10 @@
               <w:spacing w:after="0" w:line="240" w:lineRule="auto"/>
               <w:ind w:left="-293"/>
               <w:jc w:val="center"/>
-            </w:pPr>
-            <w:proofErr w:type="gramStart"/>
+              <w:rPr>
+                <w:rFonts w:ascii="Arial Narrow" w:hAnsi="Arial Narrow"/>
+              </w:rPr>
+            </w:pPr>
             <w:r>
               <w:rPr>
                 <w:rFonts w:ascii="Arial Narrow" w:hAnsi="Arial Narrow"/>
@@ -4855,7 +4919,6 @@
               </w:rPr>
               <w:t>{</w:t>
             </w:r>
-            <w:proofErr w:type="gramEnd"/>
             <w:r>
               <w:rPr>
                 <w:rFonts w:ascii="Arial Narrow" w:hAnsi="Arial Narrow"/>
@@ -4898,7 +4961,7 @@
               <w:rPr>
                 <w:rFonts w:ascii="Arial Narrow" w:hAnsi="Arial Narrow"/>
               </w:rPr>
-              <w:t>27</w:t>
+              <w:t>29</w:t>
             </w:r>
             <w:r>
               <w:rPr>
@@ -5006,8 +5069,10 @@
               <w:spacing w:after="0" w:line="240" w:lineRule="auto"/>
               <w:ind w:left="-293"/>
               <w:jc w:val="center"/>
-            </w:pPr>
-            <w:proofErr w:type="gramStart"/>
+              <w:rPr>
+                <w:rFonts w:ascii="Arial Narrow" w:hAnsi="Arial Narrow"/>
+              </w:rPr>
+            </w:pPr>
             <w:r>
               <w:rPr>
                 <w:rFonts w:ascii="Arial Narrow" w:hAnsi="Arial Narrow"/>
@@ -5028,7 +5093,6 @@
               </w:rPr>
               <w:t>{</w:t>
             </w:r>
-            <w:proofErr w:type="gramEnd"/>
             <w:r>
               <w:rPr>
                 <w:rFonts w:ascii="Arial Narrow" w:hAnsi="Arial Narrow"/>
@@ -5071,7 +5135,7 @@
               <w:rPr>
                 <w:rFonts w:ascii="Arial Narrow" w:hAnsi="Arial Narrow"/>
               </w:rPr>
-              <w:t>28</w:t>
+              <w:t>10</w:t>
             </w:r>
             <w:r>
               <w:rPr>
@@ -5114,7 +5178,13 @@
               <w:right w:w="0" w:type="dxa"/>
             </w:tcMar>
           </w:tcPr>
-          <w:p/>
+          <w:p>
+            <w:pPr>
+              <w:rPr>
+                <w:rFonts w:ascii="Arial Narrow" w:hAnsi="Arial Narrow"/>
+              </w:rPr>
+            </w:pPr>
+          </w:p>
         </w:tc>
         <w:tc>
           <w:tcPr>
@@ -5181,8 +5251,10 @@
               <w:spacing w:after="0" w:line="240" w:lineRule="auto"/>
               <w:ind w:left="-293"/>
               <w:jc w:val="center"/>
-            </w:pPr>
-            <w:proofErr w:type="gramStart"/>
+              <w:rPr>
+                <w:rFonts w:ascii="Arial Narrow" w:hAnsi="Arial Narrow"/>
+              </w:rPr>
+            </w:pPr>
             <w:r>
               <w:rPr>
                 <w:rFonts w:ascii="Arial Narrow" w:hAnsi="Arial Narrow"/>
@@ -5203,7 +5275,6 @@
               </w:rPr>
               <w:t>{</w:t>
             </w:r>
-            <w:proofErr w:type="gramEnd"/>
             <w:r>
               <w:rPr>
                 <w:rFonts w:ascii="Arial Narrow" w:hAnsi="Arial Narrow"/>
@@ -5246,7 +5317,7 @@
               <w:rPr>
                 <w:rFonts w:ascii="Arial Narrow" w:hAnsi="Arial Narrow"/>
               </w:rPr>
-              <w:t>29</w:t>
+              <w:t>20</w:t>
             </w:r>
             <w:r>
               <w:rPr>
@@ -5296,7 +5367,13 @@
               <w:right w:w="0" w:type="dxa"/>
             </w:tcMar>
           </w:tcPr>
-          <w:p/>
+          <w:p>
+            <w:pPr>
+              <w:rPr>
+                <w:rFonts w:ascii="Arial Narrow" w:hAnsi="Arial Narrow"/>
+              </w:rPr>
+            </w:pPr>
+          </w:p>
         </w:tc>
         <w:tc>
           <w:tcPr>
@@ -5363,8 +5440,10 @@
               <w:spacing w:after="0" w:line="240" w:lineRule="auto"/>
               <w:ind w:left="-293"/>
               <w:jc w:val="center"/>
-            </w:pPr>
-            <w:proofErr w:type="gramStart"/>
+              <w:rPr>
+                <w:rFonts w:ascii="Arial Narrow" w:hAnsi="Arial Narrow"/>
+              </w:rPr>
+            </w:pPr>
             <w:r>
               <w:rPr>
                 <w:rFonts w:ascii="Arial Narrow" w:hAnsi="Arial Narrow"/>
@@ -5385,7 +5464,6 @@
               </w:rPr>
               <w:t>{</w:t>
             </w:r>
-            <w:proofErr w:type="gramEnd"/>
             <w:r>
               <w:rPr>
                 <w:rFonts w:ascii="Arial Narrow" w:hAnsi="Arial Narrow"/>
@@ -5428,13 +5506,7 @@
               <w:rPr>
                 <w:rFonts w:ascii="Arial Narrow" w:hAnsi="Arial Narrow"/>
               </w:rPr>
-              <w:t>30</w:t>
-            </w:r>
-            <w:r>
-              <w:rPr>
-                <w:rFonts w:ascii="Arial Narrow" w:hAnsi="Arial Narrow"/>
-              </w:rPr>
-              <w:t xml:space="preserve"> of </w:t>
+              <w:t xml:space="preserve">30 of </w:t>
             </w:r>
             <w:r>
               <w:rPr>
@@ -5469,6 +5541,9 @@
     <w:p>
       <w:pPr>
         <w:spacing w:after="0" w:line="20" w:lineRule="exact"/>
+        <w:rPr>
+          <w:rFonts w:ascii="Arial Narrow" w:hAnsi="Arial Narrow"/>
+        </w:rPr>
       </w:pPr>
     </w:p>
     <w:sectPr>
@@ -5478,6 +5553,56 @@
     </w:sectPr>
   </w:body>
 </w:document>
+</file>
+
+<file path=word/endnotes.xml><?xml version="1.0" encoding="utf-8"?>
+<w:endnotes xmlns:wpc="http://schemas.microsoft.com/office/word/2010/wordprocessingCanvas" xmlns:cx="http://schemas.microsoft.com/office/drawing/2014/chartex" xmlns:cx1="http://schemas.microsoft.com/office/drawing/2015/9/8/chartex" xmlns:cx2="http://schemas.microsoft.com/office/drawing/2015/10/21/chartex" xmlns:cx3="http://schemas.microsoft.com/office/drawing/2016/5/9/chartex" xmlns:cx4="http://schemas.microsoft.com/office/drawing/2016/5/10/chartex" xmlns:cx5="http://schemas.microsoft.com/office/drawing/2016/5/11/chartex" xmlns:cx6="http://schemas.microsoft.com/office/drawing/2016/5/12/chartex" xmlns:cx7="http://schemas.microsoft.com/office/drawing/2016/5/13/chartex" xmlns:cx8="http://schemas.microsoft.com/office/drawing/2016/5/14/chartex" xmlns:mc="http://schemas.openxmlformats.org/markup-compatibility/2006" xmlns:aink="http://schemas.microsoft.com/office/drawing/2016/ink" xmlns:am3d="http://schemas.microsoft.com/office/drawing/2017/model3d" xmlns:o="urn:schemas-microsoft-com:office:office" xmlns:oel="http://schemas.microsoft.com/office/2019/extlst" xmlns:r="http://schemas.openxmlformats.org/officeDocument/2006/relationships" xmlns:m="http://schemas.openxmlformats.org/officeDocument/2006/math" xmlns:v="urn:schemas-microsoft-com:vml" xmlns:wp14="http://schemas.microsoft.com/office/word/2010/wordprocessingDrawing" xmlns:wp="http://schemas.openxmlformats.org/drawingml/2006/wordprocessingDrawing" xmlns:w10="urn:schemas-microsoft-com:office:word" xmlns:w="http://schemas.openxmlformats.org/wordprocessingml/2006/main" xmlns:w14="http://schemas.microsoft.com/office/word/2010/wordml" xmlns:w15="http://schemas.microsoft.com/office/word/2012/wordml" xmlns:w16cex="http://schemas.microsoft.com/office/word/2018/wordml/cex" xmlns:w16cid="http://schemas.microsoft.com/office/word/2016/wordml/cid" xmlns:w16="http://schemas.microsoft.com/office/word/2018/wordml" xmlns:w16du="http://schemas.microsoft.com/office/word/2023/wordml/word16du" xmlns:w16sdtdh="http://schemas.microsoft.com/office/word/2020/wordml/sdtdatahash" xmlns:w16sdtfl="http://schemas.microsoft.com/office/word/2024/wordml/sdtformatlock" xmlns:w16se="http://schemas.microsoft.com/office/word/2015/wordml/symex" xmlns:wpg="http://schemas.microsoft.com/office/word/2010/wordprocessingGroup" xmlns:wpi="http://schemas.microsoft.com/office/word/2010/wordprocessingInk" xmlns:wne="http://schemas.microsoft.com/office/word/2006/wordml" xmlns:wps="http://schemas.microsoft.com/office/word/2010/wordprocessingShape" mc:Ignorable="w14 w15 w16se w16cid w16 w16cex w16sdtdh w16sdtfl w16du wp14">
+  <w:endnote w:type="separator" w:id="-1">
+    <w:p>
+      <w:pPr>
+        <w:spacing w:after="0" w:line="240" w:lineRule="auto"/>
+      </w:pPr>
+      <w:r>
+        <w:separator/>
+      </w:r>
+    </w:p>
+  </w:endnote>
+  <w:endnote w:type="continuationSeparator" w:id="0">
+    <w:p>
+      <w:pPr>
+        <w:spacing w:after="0" w:line="240" w:lineRule="auto"/>
+      </w:pPr>
+      <w:r>
+        <w:continuationSeparator/>
+      </w:r>
+    </w:p>
+  </w:endnote>
+</w:endnotes>
+</file>
+
+<file path=word/footnotes.xml><?xml version="1.0" encoding="utf-8"?>
+<w:footnotes xmlns:wpc="http://schemas.microsoft.com/office/word/2010/wordprocessingCanvas" xmlns:cx="http://schemas.microsoft.com/office/drawing/2014/chartex" xmlns:cx1="http://schemas.microsoft.com/office/drawing/2015/9/8/chartex" xmlns:cx2="http://schemas.microsoft.com/office/drawing/2015/10/21/chartex" xmlns:cx3="http://schemas.microsoft.com/office/drawing/2016/5/9/chartex" xmlns:cx4="http://schemas.microsoft.com/office/drawing/2016/5/10/chartex" xmlns:cx5="http://schemas.microsoft.com/office/drawing/2016/5/11/chartex" xmlns:cx6="http://schemas.microsoft.com/office/drawing/2016/5/12/chartex" xmlns:cx7="http://schemas.microsoft.com/office/drawing/2016/5/13/chartex" xmlns:cx8="http://schemas.microsoft.com/office/drawing/2016/5/14/chartex" xmlns:mc="http://schemas.openxmlformats.org/markup-compatibility/2006" xmlns:aink="http://schemas.microsoft.com/office/drawing/2016/ink" xmlns:am3d="http://schemas.microsoft.com/office/drawing/2017/model3d" xmlns:o="urn:schemas-microsoft-com:office:office" xmlns:oel="http://schemas.microsoft.com/office/2019/extlst" xmlns:r="http://schemas.openxmlformats.org/officeDocument/2006/relationships" xmlns:m="http://schemas.openxmlformats.org/officeDocument/2006/math" xmlns:v="urn:schemas-microsoft-com:vml" xmlns:wp14="http://schemas.microsoft.com/office/word/2010/wordprocessingDrawing" xmlns:wp="http://schemas.openxmlformats.org/drawingml/2006/wordprocessingDrawing" xmlns:w10="urn:schemas-microsoft-com:office:word" xmlns:w="http://schemas.openxmlformats.org/wordprocessingml/2006/main" xmlns:w14="http://schemas.microsoft.com/office/word/2010/wordml" xmlns:w15="http://schemas.microsoft.com/office/word/2012/wordml" xmlns:w16cex="http://schemas.microsoft.com/office/word/2018/wordml/cex" xmlns:w16cid="http://schemas.microsoft.com/office/word/2016/wordml/cid" xmlns:w16="http://schemas.microsoft.com/office/word/2018/wordml" xmlns:w16du="http://schemas.microsoft.com/office/word/2023/wordml/word16du" xmlns:w16sdtdh="http://schemas.microsoft.com/office/word/2020/wordml/sdtdatahash" xmlns:w16sdtfl="http://schemas.microsoft.com/office/word/2024/wordml/sdtformatlock" xmlns:w16se="http://schemas.microsoft.com/office/word/2015/wordml/symex" xmlns:wpg="http://schemas.microsoft.com/office/word/2010/wordprocessingGroup" xmlns:wpi="http://schemas.microsoft.com/office/word/2010/wordprocessingInk" xmlns:wne="http://schemas.microsoft.com/office/word/2006/wordml" xmlns:wps="http://schemas.microsoft.com/office/word/2010/wordprocessingShape" mc:Ignorable="w14 w15 w16se w16cid w16 w16cex w16sdtdh w16sdtfl w16du wp14">
+  <w:footnote w:type="separator" w:id="-1">
+    <w:p>
+      <w:pPr>
+        <w:spacing w:after="0" w:line="240" w:lineRule="auto"/>
+      </w:pPr>
+      <w:r>
+        <w:separator/>
+      </w:r>
+    </w:p>
+  </w:footnote>
+  <w:footnote w:type="continuationSeparator" w:id="0">
+    <w:p>
+      <w:pPr>
+        <w:spacing w:after="0" w:line="240" w:lineRule="auto"/>
+      </w:pPr>
+      <w:r>
+        <w:continuationSeparator/>
+      </w:r>
+    </w:p>
+  </w:footnote>
+</w:footnotes>
 </file>
 
 <file path=word/styles.xml><?xml version="1.0" encoding="utf-8"?>
@@ -6494,6 +6619,66 @@
       <w14:ligatures w14:val="none"/>
     </w:rPr>
   </w:style>
+  <w:style w:type="paragraph" w:styleId="Header">
+    <w:name w:val="header"/>
+    <w:basedOn w:val="Normal"/>
+    <w:link w:val="HeaderChar"/>
+    <w:uiPriority w:val="99"/>
+    <w:unhideWhenUsed/>
+    <w:rsid w:val="00704A0A"/>
+    <w:pPr>
+      <w:tabs>
+        <w:tab w:val="center" w:pos="4680"/>
+        <w:tab w:val="right" w:pos="9360"/>
+      </w:tabs>
+      <w:spacing w:after="0" w:line="240" w:lineRule="auto"/>
+    </w:pPr>
+  </w:style>
+  <w:style w:type="character" w:customStyle="1" w:styleId="HeaderChar">
+    <w:name w:val="Header Char"/>
+    <w:basedOn w:val="DefaultParagraphFont"/>
+    <w:link w:val="Header"/>
+    <w:uiPriority w:val="99"/>
+    <w:rsid w:val="00704A0A"/>
+    <w:rPr>
+      <w:rFonts w:ascii="Calibri" w:eastAsia="Times New Roman" w:hAnsi="Calibri" w:cs="Times New Roman"/>
+      <w:kern w:val="0"/>
+      <w:sz w:val="22"/>
+      <w:szCs w:val="22"/>
+      <w:lang w:bidi="ar-SA"/>
+      <w14:ligatures w14:val="none"/>
+    </w:rPr>
+  </w:style>
+  <w:style w:type="paragraph" w:styleId="Footer">
+    <w:name w:val="footer"/>
+    <w:basedOn w:val="Normal"/>
+    <w:link w:val="FooterChar"/>
+    <w:uiPriority w:val="99"/>
+    <w:unhideWhenUsed/>
+    <w:rsid w:val="00704A0A"/>
+    <w:pPr>
+      <w:tabs>
+        <w:tab w:val="center" w:pos="4680"/>
+        <w:tab w:val="right" w:pos="9360"/>
+      </w:tabs>
+      <w:spacing w:after="0" w:line="240" w:lineRule="auto"/>
+    </w:pPr>
+  </w:style>
+  <w:style w:type="character" w:customStyle="1" w:styleId="FooterChar">
+    <w:name w:val="Footer Char"/>
+    <w:basedOn w:val="DefaultParagraphFont"/>
+    <w:link w:val="Footer"/>
+    <w:uiPriority w:val="99"/>
+    <w:rsid w:val="00704A0A"/>
+    <w:rPr>
+      <w:rFonts w:ascii="Calibri" w:eastAsia="Times New Roman" w:hAnsi="Calibri" w:cs="Times New Roman"/>
+      <w:kern w:val="0"/>
+      <w:sz w:val="22"/>
+      <w:szCs w:val="22"/>
+      <w:lang w:bidi="ar-SA"/>
+      <w14:ligatures w14:val="none"/>
+    </w:rPr>
+  </w:style>
 </w:styles>
 </file>
 

</xml_diff>